<commit_message>
laporan latihan 1-5: contekan tulisan tangan 3 lembar, slot foto jadi 3
</commit_message>
<xml_diff>
--- a/teori-bu-rahil/2026-10-09-laporan-latihan-1-5/PLP_P3-4-5_TE_2B_048.docx
+++ b/teori-bu-rahil/2026-10-09-laporan-latihan-1-5/PLP_P3-4-5_TE_2B_048.docx
@@ -202,7 +202,7 @@
           <w:b/>
           <w:sz w:val="28"/>
         </w:rPr>
-        <w:t>LATIHAN 1</w:t>
+        <w:t>LATIHAN 1 DAN 2</w:t>
       </w:r>
     </w:p>
     <w:p>
@@ -217,7 +217,7 @@
           <w:b/>
           <w:sz w:val="28"/>
         </w:rPr>
-        <w:t>Mengubah RegEx Menjadi String</w:t>
+        <w:t>Mengubah RegEx Menjadi String dan Membuat RegEx Sesuai Deskripsi</w:t>
       </w:r>
     </w:p>
     <w:p>
@@ -245,7 +245,7 @@
       </w:tblGrid>
       <w:tr>
         <w:trPr>
-          <w:trHeight w:val="12096" w:hRule="exact"/>
+          <w:trHeight w:val="11807" w:hRule="exact"/>
         </w:trPr>
         <w:tc>
           <w:tcPr>
@@ -261,89 +261,7 @@
                 <w:rFonts w:ascii="Times New Roman" w:hAnsi="Times New Roman"/>
                 <w:sz w:val="24"/>
               </w:rPr>
-              <w:t>Tempel foto tulisan tangan Latihan 1 di sini</w:t>
-            </w:r>
-          </w:p>
-        </w:tc>
-      </w:tr>
-    </w:tbl>
-    <w:p>
-      <w:r>
-        <w:br w:type="page"/>
-      </w:r>
-    </w:p>
-    <w:p>
-      <w:pPr>
-        <w:keepNext/>
-        <w:spacing w:line="276" w:lineRule="auto" w:after="40" w:before="0"/>
-        <w:jc w:val="center"/>
-      </w:pPr>
-      <w:r>
-        <w:rPr>
-          <w:rFonts w:ascii="Times New Roman" w:hAnsi="Times New Roman"/>
-          <w:b/>
-          <w:sz w:val="28"/>
-        </w:rPr>
-        <w:t>LATIHAN 2</w:t>
-      </w:r>
-    </w:p>
-    <w:p>
-      <w:pPr>
-        <w:keepNext/>
-        <w:spacing w:line="276" w:lineRule="auto" w:after="40" w:before="0"/>
-        <w:jc w:val="center"/>
-      </w:pPr>
-      <w:r>
-        <w:rPr>
-          <w:rFonts w:ascii="Times New Roman" w:hAnsi="Times New Roman"/>
-          <w:b/>
-          <w:sz w:val="28"/>
-        </w:rPr>
-        <w:t>Membuat RegEx Sesuai Deskripsi</w:t>
-      </w:r>
-    </w:p>
-    <w:p>
-      <w:pPr>
-        <w:spacing w:line="360" w:lineRule="auto" w:after="80" w:before="0"/>
-        <w:jc w:val="both"/>
-      </w:pPr>
-    </w:p>
-    <w:tbl>
-      <w:tblPr>
-        <w:tblW w:type="auto" w:w="0"/>
-        <w:jc w:val="center"/>
-        <w:tblLook w:firstColumn="1" w:firstRow="1" w:lastColumn="0" w:lastRow="0" w:noHBand="0" w:noVBand="1" w:val="04A0"/>
-        <w:tblBorders>
-          <w:top w:val="single" w:sz="4" w:color="999999"/>
-          <w:left w:val="single" w:sz="4" w:color="999999"/>
-          <w:bottom w:val="single" w:sz="4" w:color="999999"/>
-          <w:right w:val="single" w:sz="4" w:color="999999"/>
-          <w:insideH w:val="single" w:sz="4" w:color="999999"/>
-          <w:insideV w:val="single" w:sz="4" w:color="999999"/>
-        </w:tblBorders>
-      </w:tblPr>
-      <w:tblGrid>
-        <w:gridCol w:w="9026"/>
-      </w:tblGrid>
-      <w:tr>
-        <w:trPr>
-          <w:trHeight w:val="12096" w:hRule="exact"/>
-        </w:trPr>
-        <w:tc>
-          <w:tcPr>
-            <w:tcW w:type="dxa" w:w="9029"/>
-            <w:vAlign w:val="center"/>
-          </w:tcPr>
-          <w:p>
-            <w:pPr>
-              <w:jc w:val="center"/>
-            </w:pPr>
-            <w:r>
-              <w:rPr>
-                <w:rFonts w:ascii="Times New Roman" w:hAnsi="Times New Roman"/>
-                <w:sz w:val="24"/>
-              </w:rPr>
-              <w:t>Tempel foto tulisan tangan Latihan 2 di sini</w:t>
+              <w:t>Tempel foto tulisan tangan lembar 1 di sini</w:t>
             </w:r>
           </w:p>
         </w:tc>
@@ -3921,7 +3839,7 @@
           <w:b/>
           <w:sz w:val="28"/>
         </w:rPr>
-        <w:t>LATIHAN 4</w:t>
+        <w:t>LATIHAN 4 DAN 5</w:t>
       </w:r>
     </w:p>
     <w:p>
@@ -3936,7 +3854,7 @@
           <w:b/>
           <w:sz w:val="28"/>
         </w:rPr>
-        <w:t>Mengubah RegEx Menjadi NFA</w:t>
+        <w:t>Mengubah RegEx Menjadi NFA dan NFA Menjadi DFA</w:t>
       </w:r>
     </w:p>
     <w:p>
@@ -3964,7 +3882,7 @@
       </w:tblGrid>
       <w:tr>
         <w:trPr>
-          <w:trHeight w:val="12096" w:hRule="exact"/>
+          <w:trHeight w:val="11807" w:hRule="exact"/>
         </w:trPr>
         <w:tc>
           <w:tcPr>
@@ -3980,7 +3898,7 @@
                 <w:rFonts w:ascii="Times New Roman" w:hAnsi="Times New Roman"/>
                 <w:sz w:val="24"/>
               </w:rPr>
-              <w:t>Tempel foto tulisan tangan Latihan 4 di sini</w:t>
+              <w:t>Tempel foto tulisan tangan lembar 2 di sini</w:t>
             </w:r>
           </w:p>
         </w:tc>
@@ -3990,42 +3908,6 @@
       <w:r>
         <w:br w:type="page"/>
       </w:r>
-    </w:p>
-    <w:p>
-      <w:pPr>
-        <w:keepNext/>
-        <w:spacing w:line="276" w:lineRule="auto" w:after="40" w:before="0"/>
-        <w:jc w:val="center"/>
-      </w:pPr>
-      <w:r>
-        <w:rPr>
-          <w:rFonts w:ascii="Times New Roman" w:hAnsi="Times New Roman"/>
-          <w:b/>
-          <w:sz w:val="28"/>
-        </w:rPr>
-        <w:t>LATIHAN 5</w:t>
-      </w:r>
-    </w:p>
-    <w:p>
-      <w:pPr>
-        <w:keepNext/>
-        <w:spacing w:line="276" w:lineRule="auto" w:after="40" w:before="0"/>
-        <w:jc w:val="center"/>
-      </w:pPr>
-      <w:r>
-        <w:rPr>
-          <w:rFonts w:ascii="Times New Roman" w:hAnsi="Times New Roman"/>
-          <w:b/>
-          <w:sz w:val="28"/>
-        </w:rPr>
-        <w:t>Mengubah NFA Menjadi DFA</w:t>
-      </w:r>
-    </w:p>
-    <w:p>
-      <w:pPr>
-        <w:spacing w:line="360" w:lineRule="auto" w:after="80" w:before="0"/>
-        <w:jc w:val="both"/>
-      </w:pPr>
     </w:p>
     <w:tbl>
       <w:tblPr>
@@ -4046,7 +3928,7 @@
       </w:tblGrid>
       <w:tr>
         <w:trPr>
-          <w:trHeight w:val="12096" w:hRule="exact"/>
+          <w:trHeight w:val="11807" w:hRule="exact"/>
         </w:trPr>
         <w:tc>
           <w:tcPr>
@@ -4062,7 +3944,7 @@
                 <w:rFonts w:ascii="Times New Roman" w:hAnsi="Times New Roman"/>
                 <w:sz w:val="24"/>
               </w:rPr>
-              <w:t>Tempel foto tulisan tangan Latihan 5 di sini</w:t>
+              <w:t>Tempel foto tulisan tangan lembar 3 di sini</w:t>
             </w:r>
           </w:p>
         </w:tc>

</xml_diff>